<commit_message>
Add vessel operator question and assumption to Section 5
</commit_message>
<xml_diff>
--- a/report/CA1-rules-uncertainty3.docx
+++ b/report/CA1-rules-uncertainty3.docx
@@ -20,9 +20,6 @@
     <w:p>
       <w:pPr>
         <w:pStyle w:val="Heading2"/>
-        <w:rPr>
-          <w:lang w:val="ru-RU"/>
-        </w:rPr>
       </w:pPr>
       <w:r>
         <w:t>5.1 Business rules</w:t>
@@ -51,12 +48,6 @@
         <w:gridCol w:w="2700"/>
       </w:tblGrid>
       <w:tr>
-        <w:tblPrEx>
-          <w:tblCellMar>
-            <w:top w:w="0" w:type="dxa"/>
-            <w:bottom w:w="0" w:type="dxa"/>
-          </w:tblCellMar>
-        </w:tblPrEx>
         <w:trPr>
           <w:tblHeader/>
         </w:trPr>
@@ -158,12 +149,6 @@
         </w:tc>
       </w:tr>
       <w:tr>
-        <w:tblPrEx>
-          <w:tblCellMar>
-            <w:top w:w="0" w:type="dxa"/>
-            <w:bottom w:w="0" w:type="dxa"/>
-          </w:tblCellMar>
-        </w:tblPrEx>
         <w:trPr>
           <w:cantSplit/>
         </w:trPr>
@@ -256,12 +241,6 @@
         </w:tc>
       </w:tr>
       <w:tr>
-        <w:tblPrEx>
-          <w:tblCellMar>
-            <w:top w:w="0" w:type="dxa"/>
-            <w:bottom w:w="0" w:type="dxa"/>
-          </w:tblCellMar>
-        </w:tblPrEx>
         <w:trPr>
           <w:cantSplit/>
         </w:trPr>
@@ -354,12 +333,6 @@
         </w:tc>
       </w:tr>
       <w:tr>
-        <w:tblPrEx>
-          <w:tblCellMar>
-            <w:top w:w="0" w:type="dxa"/>
-            <w:bottom w:w="0" w:type="dxa"/>
-          </w:tblCellMar>
-        </w:tblPrEx>
         <w:trPr>
           <w:cantSplit/>
         </w:trPr>
@@ -452,12 +425,6 @@
         </w:tc>
       </w:tr>
       <w:tr>
-        <w:tblPrEx>
-          <w:tblCellMar>
-            <w:top w:w="0" w:type="dxa"/>
-            <w:bottom w:w="0" w:type="dxa"/>
-          </w:tblCellMar>
-        </w:tblPrEx>
         <w:trPr>
           <w:cantSplit/>
         </w:trPr>
@@ -550,12 +517,6 @@
         </w:tc>
       </w:tr>
       <w:tr>
-        <w:tblPrEx>
-          <w:tblCellMar>
-            <w:top w:w="0" w:type="dxa"/>
-            <w:bottom w:w="0" w:type="dxa"/>
-          </w:tblCellMar>
-        </w:tblPrEx>
         <w:trPr>
           <w:cantSplit/>
         </w:trPr>
@@ -648,12 +609,6 @@
         </w:tc>
       </w:tr>
       <w:tr>
-        <w:tblPrEx>
-          <w:tblCellMar>
-            <w:top w:w="0" w:type="dxa"/>
-            <w:bottom w:w="0" w:type="dxa"/>
-          </w:tblCellMar>
-        </w:tblPrEx>
         <w:trPr>
           <w:cantSplit/>
         </w:trPr>
@@ -746,12 +701,6 @@
         </w:tc>
       </w:tr>
       <w:tr>
-        <w:tblPrEx>
-          <w:tblCellMar>
-            <w:top w:w="0" w:type="dxa"/>
-            <w:bottom w:w="0" w:type="dxa"/>
-          </w:tblCellMar>
-        </w:tblPrEx>
         <w:trPr>
           <w:cantSplit/>
         </w:trPr>
@@ -883,12 +832,6 @@
         <w:gridCol w:w="3500"/>
       </w:tblGrid>
       <w:tr>
-        <w:tblPrEx>
-          <w:tblCellMar>
-            <w:top w:w="0" w:type="dxa"/>
-            <w:bottom w:w="0" w:type="dxa"/>
-          </w:tblCellMar>
-        </w:tblPrEx>
         <w:trPr>
           <w:tblHeader/>
         </w:trPr>
@@ -990,12 +933,6 @@
         </w:tc>
       </w:tr>
       <w:tr>
-        <w:tblPrEx>
-          <w:tblCellMar>
-            <w:top w:w="0" w:type="dxa"/>
-            <w:bottom w:w="0" w:type="dxa"/>
-          </w:tblCellMar>
-        </w:tblPrEx>
         <w:trPr>
           <w:cantSplit/>
         </w:trPr>
@@ -1088,12 +1025,6 @@
         </w:tc>
       </w:tr>
       <w:tr>
-        <w:tblPrEx>
-          <w:tblCellMar>
-            <w:top w:w="0" w:type="dxa"/>
-            <w:bottom w:w="0" w:type="dxa"/>
-          </w:tblCellMar>
-        </w:tblPrEx>
         <w:trPr>
           <w:cantSplit/>
         </w:trPr>
@@ -1186,12 +1117,6 @@
         </w:tc>
       </w:tr>
       <w:tr>
-        <w:tblPrEx>
-          <w:tblCellMar>
-            <w:top w:w="0" w:type="dxa"/>
-            <w:bottom w:w="0" w:type="dxa"/>
-          </w:tblCellMar>
-        </w:tblPrEx>
         <w:trPr>
           <w:cantSplit/>
         </w:trPr>
@@ -1284,12 +1209,6 @@
         </w:tc>
       </w:tr>
       <w:tr>
-        <w:tblPrEx>
-          <w:tblCellMar>
-            <w:top w:w="0" w:type="dxa"/>
-            <w:bottom w:w="0" w:type="dxa"/>
-          </w:tblCellMar>
-        </w:tblPrEx>
         <w:trPr>
           <w:cantSplit/>
         </w:trPr>
@@ -1382,12 +1301,6 @@
         </w:tc>
       </w:tr>
       <w:tr>
-        <w:tblPrEx>
-          <w:tblCellMar>
-            <w:top w:w="0" w:type="dxa"/>
-            <w:bottom w:w="0" w:type="dxa"/>
-          </w:tblCellMar>
-        </w:tblPrEx>
         <w:trPr>
           <w:cantSplit/>
         </w:trPr>
@@ -1519,12 +1432,6 @@
         <w:gridCol w:w="3500"/>
       </w:tblGrid>
       <w:tr>
-        <w:tblPrEx>
-          <w:tblCellMar>
-            <w:top w:w="0" w:type="dxa"/>
-            <w:bottom w:w="0" w:type="dxa"/>
-          </w:tblCellMar>
-        </w:tblPrEx>
         <w:trPr>
           <w:tblHeader/>
         </w:trPr>
@@ -1626,12 +1533,6 @@
         </w:tc>
       </w:tr>
       <w:tr>
-        <w:tblPrEx>
-          <w:tblCellMar>
-            <w:top w:w="0" w:type="dxa"/>
-            <w:bottom w:w="0" w:type="dxa"/>
-          </w:tblCellMar>
-        </w:tblPrEx>
         <w:trPr>
           <w:cantSplit/>
         </w:trPr>
@@ -1724,12 +1625,6 @@
         </w:tc>
       </w:tr>
       <w:tr>
-        <w:tblPrEx>
-          <w:tblCellMar>
-            <w:top w:w="0" w:type="dxa"/>
-            <w:bottom w:w="0" w:type="dxa"/>
-          </w:tblCellMar>
-        </w:tblPrEx>
         <w:trPr>
           <w:cantSplit/>
         </w:trPr>
@@ -1822,12 +1717,6 @@
         </w:tc>
       </w:tr>
       <w:tr>
-        <w:tblPrEx>
-          <w:tblCellMar>
-            <w:top w:w="0" w:type="dxa"/>
-            <w:bottom w:w="0" w:type="dxa"/>
-          </w:tblCellMar>
-        </w:tblPrEx>
         <w:trPr>
           <w:cantSplit/>
         </w:trPr>
@@ -1920,12 +1809,6 @@
         </w:tc>
       </w:tr>
       <w:tr>
-        <w:tblPrEx>
-          <w:tblCellMar>
-            <w:top w:w="0" w:type="dxa"/>
-            <w:bottom w:w="0" w:type="dxa"/>
-          </w:tblCellMar>
-        </w:tblPrEx>
         <w:trPr>
           <w:cantSplit/>
         </w:trPr>
@@ -2018,12 +1901,6 @@
         </w:tc>
       </w:tr>
       <w:tr>
-        <w:tblPrEx>
-          <w:tblCellMar>
-            <w:top w:w="0" w:type="dxa"/>
-            <w:bottom w:w="0" w:type="dxa"/>
-          </w:tblCellMar>
-        </w:tblPrEx>
         <w:trPr>
           <w:cantSplit/>
         </w:trPr>
@@ -2117,12 +1994,6 @@
         </w:tc>
       </w:tr>
       <w:tr>
-        <w:tblPrEx>
-          <w:tblCellMar>
-            <w:top w:w="0" w:type="dxa"/>
-            <w:bottom w:w="0" w:type="dxa"/>
-          </w:tblCellMar>
-        </w:tblPrEx>
         <w:trPr>
           <w:cantSplit/>
         </w:trPr>
@@ -2210,6 +2081,110 @@
                 <w:szCs w:val="20"/>
               </w:rPr>
               <w:t>Section 3 – based on the Session 3 lab example</w:t>
+            </w:r>
+          </w:p>
+        </w:tc>
+      </w:tr>
+      <w:tr>
+        <w:trPr>
+          <w:cantSplit/>
+        </w:trPr>
+        <w:tc>
+          <w:tcPr>
+            <w:tcW w:w="900" w:type="dxa"/>
+            <w:tcBorders>
+              <w:top w:val="single" w:sz="4" w:space="0" w:color="A9B4C2"/>
+              <w:left w:val="single" w:sz="4" w:space="0" w:color="A9B4C2"/>
+              <w:bottom w:val="single" w:sz="4" w:space="0" w:color="A9B4C2"/>
+              <w:right w:val="single" w:sz="4" w:space="0" w:color="A9B4C2"/>
+            </w:tcBorders>
+            <w:tcMar>
+              <w:top w:w="60" w:type="dxa"/>
+              <w:left w:w="100" w:type="dxa"/>
+              <w:bottom w:w="60" w:type="dxa"/>
+              <w:right w:w="100" w:type="dxa"/>
+            </w:tcMar>
+          </w:tcPr>
+          <w:p>
+            <w:pPr>
+              <w:spacing w:after="30"/>
+              <w:rPr>
+                <w:sz w:val="20"/>
+                <w:szCs w:val="20"/>
+              </w:rPr>
+            </w:pPr>
+            <w:r>
+              <w:rPr>
+                <w:sz w:val="20"/>
+                <w:szCs w:val="20"/>
+              </w:rPr>
+              <w:t>A07</w:t>
+            </w:r>
+          </w:p>
+        </w:tc>
+        <w:tc>
+          <w:tcPr>
+            <w:tcW w:w="5600" w:type="dxa"/>
+            <w:tcBorders>
+              <w:top w:val="single" w:sz="4" w:space="0" w:color="A9B4C2"/>
+              <w:left w:val="single" w:sz="4" w:space="0" w:color="A9B4C2"/>
+              <w:bottom w:val="single" w:sz="4" w:space="0" w:color="A9B4C2"/>
+              <w:right w:val="single" w:sz="4" w:space="0" w:color="A9B4C2"/>
+            </w:tcBorders>
+            <w:tcMar>
+              <w:top w:w="60" w:type="dxa"/>
+              <w:left w:w="100" w:type="dxa"/>
+              <w:bottom w:w="60" w:type="dxa"/>
+              <w:right w:w="100" w:type="dxa"/>
+            </w:tcMar>
+          </w:tcPr>
+          <w:p>
+            <w:pPr>
+              <w:spacing w:after="30"/>
+              <w:rPr>
+                <w:sz w:val="20"/>
+                <w:szCs w:val="20"/>
+              </w:rPr>
+            </w:pPr>
+            <w:r>
+              <w:rPr>
+                <w:sz w:val="20"/>
+                <w:szCs w:val="20"/>
+              </w:rPr>
+              <w:t>Harbour staff enter berth requests and changes for the vessel operators. The operators do not use the system themselves. This is only an assumption, not a fact (see Q23).</w:t>
+            </w:r>
+          </w:p>
+        </w:tc>
+        <w:tc>
+          <w:tcPr>
+            <w:tcW w:w="3500" w:type="dxa"/>
+            <w:tcBorders>
+              <w:top w:val="single" w:sz="4" w:space="0" w:color="A9B4C2"/>
+              <w:left w:val="single" w:sz="4" w:space="0" w:color="A9B4C2"/>
+              <w:bottom w:val="single" w:sz="4" w:space="0" w:color="A9B4C2"/>
+              <w:right w:val="single" w:sz="4" w:space="0" w:color="A9B4C2"/>
+            </w:tcBorders>
+            <w:tcMar>
+              <w:top w:w="60" w:type="dxa"/>
+              <w:left w:w="100" w:type="dxa"/>
+              <w:bottom w:w="60" w:type="dxa"/>
+              <w:right w:w="100" w:type="dxa"/>
+            </w:tcMar>
+          </w:tcPr>
+          <w:p>
+            <w:pPr>
+              <w:spacing w:after="30"/>
+              <w:rPr>
+                <w:sz w:val="20"/>
+                <w:szCs w:val="20"/>
+              </w:rPr>
+            </w:pPr>
+            <w:r>
+              <w:rPr>
+                <w:sz w:val="20"/>
+                <w:szCs w:val="20"/>
+              </w:rPr>
+              <w:t>My own view (Section 1.1, E04)</w:t>
             </w:r>
           </w:p>
         </w:tc>
@@ -2254,12 +2229,6 @@
         <w:gridCol w:w="3500"/>
       </w:tblGrid>
       <w:tr>
-        <w:tblPrEx>
-          <w:tblCellMar>
-            <w:top w:w="0" w:type="dxa"/>
-            <w:bottom w:w="0" w:type="dxa"/>
-          </w:tblCellMar>
-        </w:tblPrEx>
         <w:trPr>
           <w:tblHeader/>
         </w:trPr>
@@ -2361,12 +2330,6 @@
         </w:tc>
       </w:tr>
       <w:tr>
-        <w:tblPrEx>
-          <w:tblCellMar>
-            <w:top w:w="0" w:type="dxa"/>
-            <w:bottom w:w="0" w:type="dxa"/>
-          </w:tblCellMar>
-        </w:tblPrEx>
         <w:trPr>
           <w:cantSplit/>
         </w:trPr>
@@ -2459,12 +2422,6 @@
         </w:tc>
       </w:tr>
       <w:tr>
-        <w:tblPrEx>
-          <w:tblCellMar>
-            <w:top w:w="0" w:type="dxa"/>
-            <w:bottom w:w="0" w:type="dxa"/>
-          </w:tblCellMar>
-        </w:tblPrEx>
         <w:trPr>
           <w:cantSplit/>
         </w:trPr>
@@ -2557,12 +2514,6 @@
         </w:tc>
       </w:tr>
       <w:tr>
-        <w:tblPrEx>
-          <w:tblCellMar>
-            <w:top w:w="0" w:type="dxa"/>
-            <w:bottom w:w="0" w:type="dxa"/>
-          </w:tblCellMar>
-        </w:tblPrEx>
         <w:trPr>
           <w:cantSplit/>
         </w:trPr>
@@ -2671,9 +2622,6 @@
     <w:p>
       <w:pPr>
         <w:spacing w:after="120"/>
-        <w:rPr>
-          <w:lang w:val="ru-RU"/>
-        </w:rPr>
       </w:pPr>
       <w:r>
         <w:rPr>
@@ -2710,12 +2658,6 @@
         <w:gridCol w:w="1500"/>
       </w:tblGrid>
       <w:tr>
-        <w:tblPrEx>
-          <w:tblCellMar>
-            <w:top w:w="0" w:type="dxa"/>
-            <w:bottom w:w="0" w:type="dxa"/>
-          </w:tblCellMar>
-        </w:tblPrEx>
         <w:trPr>
           <w:tblHeader/>
         </w:trPr>
@@ -2849,12 +2791,6 @@
         </w:tc>
       </w:tr>
       <w:tr>
-        <w:tblPrEx>
-          <w:tblCellMar>
-            <w:top w:w="0" w:type="dxa"/>
-            <w:bottom w:w="0" w:type="dxa"/>
-          </w:tblCellMar>
-        </w:tblPrEx>
         <w:trPr>
           <w:cantSplit/>
         </w:trPr>
@@ -2976,12 +2912,6 @@
         </w:tc>
       </w:tr>
       <w:tr>
-        <w:tblPrEx>
-          <w:tblCellMar>
-            <w:top w:w="0" w:type="dxa"/>
-            <w:bottom w:w="0" w:type="dxa"/>
-          </w:tblCellMar>
-        </w:tblPrEx>
         <w:trPr>
           <w:cantSplit/>
         </w:trPr>
@@ -3103,12 +3033,6 @@
         </w:tc>
       </w:tr>
       <w:tr>
-        <w:tblPrEx>
-          <w:tblCellMar>
-            <w:top w:w="0" w:type="dxa"/>
-            <w:bottom w:w="0" w:type="dxa"/>
-          </w:tblCellMar>
-        </w:tblPrEx>
         <w:trPr>
           <w:cantSplit/>
         </w:trPr>
@@ -3230,12 +3154,6 @@
         </w:tc>
       </w:tr>
       <w:tr>
-        <w:tblPrEx>
-          <w:tblCellMar>
-            <w:top w:w="0" w:type="dxa"/>
-            <w:bottom w:w="0" w:type="dxa"/>
-          </w:tblCellMar>
-        </w:tblPrEx>
         <w:trPr>
           <w:cantSplit/>
         </w:trPr>
@@ -3357,12 +3275,6 @@
         </w:tc>
       </w:tr>
       <w:tr>
-        <w:tblPrEx>
-          <w:tblCellMar>
-            <w:top w:w="0" w:type="dxa"/>
-            <w:bottom w:w="0" w:type="dxa"/>
-          </w:tblCellMar>
-        </w:tblPrEx>
         <w:trPr>
           <w:cantSplit/>
         </w:trPr>
@@ -3484,12 +3396,6 @@
         </w:tc>
       </w:tr>
       <w:tr>
-        <w:tblPrEx>
-          <w:tblCellMar>
-            <w:top w:w="0" w:type="dxa"/>
-            <w:bottom w:w="0" w:type="dxa"/>
-          </w:tblCellMar>
-        </w:tblPrEx>
         <w:trPr>
           <w:cantSplit/>
         </w:trPr>
@@ -3611,12 +3517,6 @@
         </w:tc>
       </w:tr>
       <w:tr>
-        <w:tblPrEx>
-          <w:tblCellMar>
-            <w:top w:w="0" w:type="dxa"/>
-            <w:bottom w:w="0" w:type="dxa"/>
-          </w:tblCellMar>
-        </w:tblPrEx>
         <w:trPr>
           <w:cantSplit/>
         </w:trPr>
@@ -3738,12 +3638,6 @@
         </w:tc>
       </w:tr>
       <w:tr>
-        <w:tblPrEx>
-          <w:tblCellMar>
-            <w:top w:w="0" w:type="dxa"/>
-            <w:bottom w:w="0" w:type="dxa"/>
-          </w:tblCellMar>
-        </w:tblPrEx>
         <w:trPr>
           <w:cantSplit/>
         </w:trPr>
@@ -3865,12 +3759,6 @@
         </w:tc>
       </w:tr>
       <w:tr>
-        <w:tblPrEx>
-          <w:tblCellMar>
-            <w:top w:w="0" w:type="dxa"/>
-            <w:bottom w:w="0" w:type="dxa"/>
-          </w:tblCellMar>
-        </w:tblPrEx>
         <w:trPr>
           <w:cantSplit/>
         </w:trPr>
@@ -3992,12 +3880,6 @@
         </w:tc>
       </w:tr>
       <w:tr>
-        <w:tblPrEx>
-          <w:tblCellMar>
-            <w:top w:w="0" w:type="dxa"/>
-            <w:bottom w:w="0" w:type="dxa"/>
-          </w:tblCellMar>
-        </w:tblPrEx>
         <w:trPr>
           <w:cantSplit/>
         </w:trPr>
@@ -4119,12 +4001,6 @@
         </w:tc>
       </w:tr>
       <w:tr>
-        <w:tblPrEx>
-          <w:tblCellMar>
-            <w:top w:w="0" w:type="dxa"/>
-            <w:bottom w:w="0" w:type="dxa"/>
-          </w:tblCellMar>
-        </w:tblPrEx>
         <w:trPr>
           <w:cantSplit/>
         </w:trPr>
@@ -4153,6 +4029,7 @@
                 <w:sz w:val="20"/>
                 <w:szCs w:val="20"/>
               </w:rPr>
+              <w:lastRenderedPageBreak/>
               <w:t>Q17</w:t>
             </w:r>
           </w:p>
@@ -4234,6 +4111,11 @@
           <w:p>
             <w:pPr>
               <w:spacing w:after="30"/>
+              <w:rPr>
+                <w:sz w:val="20"/>
+                <w:szCs w:val="20"/>
+                <w:lang w:val="ru-RU"/>
+              </w:rPr>
             </w:pPr>
             <w:r>
               <w:rPr>
@@ -4241,6 +4123,143 @@
                 <w:szCs w:val="20"/>
               </w:rPr>
               <w:t>P8, C01</w:t>
+            </w:r>
+          </w:p>
+        </w:tc>
+      </w:tr>
+      <w:tr>
+        <w:trPr>
+          <w:cantSplit/>
+        </w:trPr>
+        <w:tc>
+          <w:tcPr>
+            <w:tcW w:w="800" w:type="dxa"/>
+            <w:tcBorders>
+              <w:top w:val="single" w:sz="4" w:space="0" w:color="A9B4C2"/>
+              <w:left w:val="single" w:sz="4" w:space="0" w:color="A9B4C2"/>
+              <w:bottom w:val="single" w:sz="4" w:space="0" w:color="A9B4C2"/>
+              <w:right w:val="single" w:sz="4" w:space="0" w:color="A9B4C2"/>
+            </w:tcBorders>
+            <w:tcMar>
+              <w:top w:w="60" w:type="dxa"/>
+              <w:left w:w="100" w:type="dxa"/>
+              <w:bottom w:w="60" w:type="dxa"/>
+              <w:right w:w="100" w:type="dxa"/>
+            </w:tcMar>
+          </w:tcPr>
+          <w:p>
+            <w:pPr>
+              <w:spacing w:after="30"/>
+              <w:rPr>
+                <w:sz w:val="20"/>
+                <w:szCs w:val="20"/>
+              </w:rPr>
+            </w:pPr>
+            <w:r>
+              <w:rPr>
+                <w:sz w:val="20"/>
+                <w:szCs w:val="20"/>
+              </w:rPr>
+              <w:t>Q23</w:t>
+            </w:r>
+          </w:p>
+        </w:tc>
+        <w:tc>
+          <w:tcPr>
+            <w:tcW w:w="3900" w:type="dxa"/>
+            <w:tcBorders>
+              <w:top w:val="single" w:sz="4" w:space="0" w:color="A9B4C2"/>
+              <w:left w:val="single" w:sz="4" w:space="0" w:color="A9B4C2"/>
+              <w:bottom w:val="single" w:sz="4" w:space="0" w:color="A9B4C2"/>
+              <w:right w:val="single" w:sz="4" w:space="0" w:color="A9B4C2"/>
+            </w:tcBorders>
+            <w:tcMar>
+              <w:top w:w="60" w:type="dxa"/>
+              <w:left w:w="100" w:type="dxa"/>
+              <w:bottom w:w="60" w:type="dxa"/>
+              <w:right w:w="100" w:type="dxa"/>
+            </w:tcMar>
+          </w:tcPr>
+          <w:p>
+            <w:pPr>
+              <w:spacing w:after="30"/>
+              <w:rPr>
+                <w:sz w:val="20"/>
+                <w:szCs w:val="20"/>
+              </w:rPr>
+            </w:pPr>
+            <w:r>
+              <w:rPr>
+                <w:sz w:val="20"/>
+                <w:szCs w:val="20"/>
+              </w:rPr>
+              <w:t>Do vessel operators use the system themselves, or only through harbour staff?</w:t>
+            </w:r>
+          </w:p>
+        </w:tc>
+        <w:tc>
+          <w:tcPr>
+            <w:tcW w:w="3800" w:type="dxa"/>
+            <w:tcBorders>
+              <w:top w:val="single" w:sz="4" w:space="0" w:color="A9B4C2"/>
+              <w:left w:val="single" w:sz="4" w:space="0" w:color="A9B4C2"/>
+              <w:bottom w:val="single" w:sz="4" w:space="0" w:color="A9B4C2"/>
+              <w:right w:val="single" w:sz="4" w:space="0" w:color="A9B4C2"/>
+            </w:tcBorders>
+            <w:tcMar>
+              <w:top w:w="60" w:type="dxa"/>
+              <w:left w:w="100" w:type="dxa"/>
+              <w:bottom w:w="60" w:type="dxa"/>
+              <w:right w:w="100" w:type="dxa"/>
+            </w:tcMar>
+          </w:tcPr>
+          <w:p>
+            <w:pPr>
+              <w:spacing w:after="30"/>
+              <w:rPr>
+                <w:sz w:val="20"/>
+                <w:szCs w:val="20"/>
+              </w:rPr>
+            </w:pPr>
+            <w:r>
+              <w:rPr>
+                <w:sz w:val="20"/>
+                <w:szCs w:val="20"/>
+              </w:rPr>
+              <w:t>It decides if operators are users of the system, and if we need accounts and access rules for them.</w:t>
+            </w:r>
+          </w:p>
+        </w:tc>
+        <w:tc>
+          <w:tcPr>
+            <w:tcW w:w="1500" w:type="dxa"/>
+            <w:tcBorders>
+              <w:top w:val="single" w:sz="4" w:space="0" w:color="A9B4C2"/>
+              <w:left w:val="single" w:sz="4" w:space="0" w:color="A9B4C2"/>
+              <w:bottom w:val="single" w:sz="4" w:space="0" w:color="A9B4C2"/>
+              <w:right w:val="single" w:sz="4" w:space="0" w:color="A9B4C2"/>
+            </w:tcBorders>
+            <w:tcMar>
+              <w:top w:w="60" w:type="dxa"/>
+              <w:left w:w="100" w:type="dxa"/>
+              <w:bottom w:w="60" w:type="dxa"/>
+              <w:right w:w="100" w:type="dxa"/>
+            </w:tcMar>
+          </w:tcPr>
+          <w:p>
+            <w:pPr>
+              <w:spacing w:after="30"/>
+              <w:rPr>
+                <w:sz w:val="20"/>
+                <w:szCs w:val="20"/>
+              </w:rPr>
+            </w:pPr>
+            <w:r>
+              <w:rPr>
+                <w:sz w:val="20"/>
+                <w:szCs w:val="20"/>
+              </w:rPr>
+              <w:t>A07, FR01, FR02, FR03, NFR01</w:t>
             </w:r>
           </w:p>
         </w:tc>

</xml_diff>